<commit_message>
HM-08f: gỡ 217 khai báo !important thừa, công cụ quét/so kiểu dáng tính toán
Co-Authored-By: Claude Sonnet 5.5 <noreply@anthropic.com>
Claude-Session: https://claude.ai/code/session_016bfgvkpo5ZM5L3ZStYgd1r
</commit_message>
<xml_diff>
--- a/handover/export/TONG_KET_LANDGIS.docx
+++ b/handover/export/TONG_KET_LANDGIS.docx
@@ -1839,7 +1839,7 @@
               <w:jc w:val="left"/>
             </w:pPr>
             <w:r>
-              <w:t xml:space="preserve">tests/regress/hm08f_css.js</w:t>
+              <w:t xml:space="preserve">tests/regress/hm08f_css.js, tests/tools/cssdump.js+cssdiff.py, tests/tools/shots.js+shotdi</w:t>
             </w:r>
           </w:p>
         </w:tc>
@@ -5592,19 +5592,16 @@
         <w:t xml:space="preserve"> </w:t>
       </w:r>
       <w:r>
-        <w:t xml:space="preserve">đã gỡ luật CSS chết (công cụ</w:t>
-      </w:r>
-      <w:r>
-        <w:t xml:space="preserve"> </w:t>
+        <w:t xml:space="preserve">đã gỡ luật CSS chết (</w:t>
       </w:r>
       <w:r>
         <w:rPr>
           <w:rStyle w:val="VerbatimChar"/>
         </w:rPr>
-        <w:t xml:space="preserve">handover/tools/prune_dead_css.py</w:t>
-      </w:r>
-      <w:r>
-        <w:t xml:space="preserve">, test</w:t>
+        <w:t xml:space="preserve">prune_dead_css.py</w:t>
+      </w:r>
+      <w:r>
+        <w:t xml:space="preserve">) và 217 khai báo</w:t>
       </w:r>
       <w:r>
         <w:t xml:space="preserve"> </w:t>
@@ -5613,10 +5610,76 @@
         <w:rPr>
           <w:rStyle w:val="VerbatimChar"/>
         </w:rPr>
-        <w:t xml:space="preserve">hm08f_css</w:t>
-      </w:r>
-      <w:r>
-        <w:t xml:space="preserve">; ảnh 360/390/430 trước–sau không đổi).</w:t>
+        <w:t xml:space="preserve">!important</w:t>
+      </w:r>
+      <w:r>
+        <w:t xml:space="preserve"> </w:t>
+      </w:r>
+      <w:r>
+        <w:t xml:space="preserve">thừa (</w:t>
+      </w:r>
+      <w:r>
+        <w:rPr>
+          <w:rStyle w:val="VerbatimChar"/>
+        </w:rPr>
+        <w:t xml:space="preserve">important_scan.js</w:t>
+      </w:r>
+      <w:r>
+        <w:t xml:space="preserve"> </w:t>
+      </w:r>
+      <w:r>
+        <w:t xml:space="preserve">+</w:t>
+      </w:r>
+      <w:r>
+        <w:t xml:space="preserve"> </w:t>
+      </w:r>
+      <w:r>
+        <w:rPr>
+          <w:rStyle w:val="VerbatimChar"/>
+        </w:rPr>
+        <w:t xml:space="preserve">strip_important.py</w:t>
+      </w:r>
+      <w:r>
+        <w:t xml:space="preserve">, kiểm bằng</w:t>
+      </w:r>
+      <w:r>
+        <w:t xml:space="preserve"> </w:t>
+      </w:r>
+      <w:r>
+        <w:rPr>
+          <w:rStyle w:val="VerbatimChar"/>
+        </w:rPr>
+        <w:t xml:space="preserve">cssdump.js</w:t>
+      </w:r>
+      <w:r>
+        <w:t xml:space="preserve">/</w:t>
+      </w:r>
+      <w:r>
+        <w:rPr>
+          <w:rStyle w:val="VerbatimChar"/>
+        </w:rPr>
+        <w:t xml:space="preserve">cssdiff.py</w:t>
+      </w:r>
+      <w:r>
+        <w:t xml:space="preserve"> </w:t>
+      </w:r>
+      <w:r>
+        <w:t xml:space="preserve">và ảnh 360/390/430; còn ~540</w:t>
+      </w:r>
+      <w:r>
+        <w:t xml:space="preserve"> </w:t>
+      </w:r>
+      <w:r>
+        <w:rPr>
+          <w:rStyle w:val="VerbatimChar"/>
+        </w:rPr>
+        <w:t xml:space="preserve">!important</w:t>
+      </w:r>
+      <w:r>
+        <w:t xml:space="preserve"> </w:t>
+      </w:r>
+      <w:r>
+        <w:t xml:space="preserve">đang có tác dụng).</w:t>
       </w:r>
       <w:r>
         <w:t xml:space="preserve"> </w:t>
@@ -5638,25 +5701,7 @@
         <w:t xml:space="preserve">#sidebar</w:t>
       </w:r>
       <w:r>
-        <w:t xml:space="preserve"> </w:t>
-      </w:r>
-      <w:r>
-        <w:t xml:space="preserve">và ~750</w:t>
-      </w:r>
-      <w:r>
-        <w:t xml:space="preserve"> </w:t>
-      </w:r>
-      <w:r>
-        <w:rPr>
-          <w:rStyle w:val="VerbatimChar"/>
-        </w:rPr>
-        <w:t xml:space="preserve">!important</w:t>
-      </w:r>
-      <w:r>
-        <w:t xml:space="preserve"> </w:t>
-      </w:r>
-      <w:r>
-        <w:t xml:space="preserve">còn sống: sidebar vẫn chứa các panel cũ mở bằng</w:t>
+        <w:t xml:space="preserve">: sidebar vẫn chứa các panel cũ mở bằng</w:t>
       </w:r>
       <w:r>
         <w:t xml:space="preserve"> </w:t>

</xml_diff>

<commit_message>
HM-08f: gỡ vỏ sidebar không hiện và CSS chết liên quan
Co-Authored-By: Claude Sonnet 5.5 <noreply@anthropic.com>
Claude-Session: https://claude.ai/code/session_016bfgvkpo5ZM5L3ZStYgd1r
</commit_message>
<xml_diff>
--- a/handover/export/TONG_KET_LANDGIS.docx
+++ b/handover/export/TONG_KET_LANDGIS.docx
@@ -5592,16 +5592,7 @@
         <w:t xml:space="preserve"> </w:t>
       </w:r>
       <w:r>
-        <w:t xml:space="preserve">đã gỡ luật CSS chết (</w:t>
-      </w:r>
-      <w:r>
-        <w:rPr>
-          <w:rStyle w:val="VerbatimChar"/>
-        </w:rPr>
-        <w:t xml:space="preserve">prune_dead_css.py</w:t>
-      </w:r>
-      <w:r>
-        <w:t xml:space="preserve">) và 217 khai báo</w:t>
+        <w:t xml:space="preserve">đã gỡ luật CSS chết, 217 khai báo</w:t>
       </w:r>
       <w:r>
         <w:t xml:space="preserve"> </w:t>
@@ -5616,31 +5607,7 @@
         <w:t xml:space="preserve"> </w:t>
       </w:r>
       <w:r>
-        <w:t xml:space="preserve">thừa (</w:t>
-      </w:r>
-      <w:r>
-        <w:rPr>
-          <w:rStyle w:val="VerbatimChar"/>
-        </w:rPr>
-        <w:t xml:space="preserve">important_scan.js</w:t>
-      </w:r>
-      <w:r>
-        <w:t xml:space="preserve"> </w:t>
-      </w:r>
-      <w:r>
-        <w:t xml:space="preserve">+</w:t>
-      </w:r>
-      <w:r>
-        <w:t xml:space="preserve"> </w:t>
-      </w:r>
-      <w:r>
-        <w:rPr>
-          <w:rStyle w:val="VerbatimChar"/>
-        </w:rPr>
-        <w:t xml:space="preserve">strip_important.py</w:t>
-      </w:r>
-      <w:r>
-        <w:t xml:space="preserve">, kiểm bằng</w:t>
+        <w:t xml:space="preserve">thừa (kiểm bằng</w:t>
       </w:r>
       <w:r>
         <w:t xml:space="preserve"> </w:t>
@@ -5664,22 +5631,7 @@
         <w:t xml:space="preserve"> </w:t>
       </w:r>
       <w:r>
-        <w:t xml:space="preserve">và ảnh 360/390/430; còn ~540</w:t>
-      </w:r>
-      <w:r>
-        <w:t xml:space="preserve"> </w:t>
-      </w:r>
-      <w:r>
-        <w:rPr>
-          <w:rStyle w:val="VerbatimChar"/>
-        </w:rPr>
-        <w:t xml:space="preserve">!important</w:t>
-      </w:r>
-      <w:r>
-        <w:t xml:space="preserve"> </w:t>
-      </w:r>
-      <w:r>
-        <w:t xml:space="preserve">đang có tác dụng).</w:t>
+        <w:t xml:space="preserve">+ ảnh 360/390/430) và toàn bộ phần vỏ sidebar không còn nhìn thấy (thanh tab, nút đóng, lớp phủ, nút ☰ ở header, JS đóng/mở tương ứng; thêm 24 luật CSS chết).</w:t>
       </w:r>
       <w:r>
         <w:t xml:space="preserve"> </w:t>
@@ -5689,19 +5641,42 @@
           <w:bCs/>
           <w:b/>
         </w:rPr>
-        <w:t xml:space="preserve">Chưa gỡ</w:t>
-      </w:r>
-      <w:r>
+        <w:t xml:space="preserve">Còn giữ</w:t>
+      </w:r>
+      <w:r>
+        <w:rPr>
+          <w:bCs/>
+          <w:b/>
+        </w:rPr>
         <w:t xml:space="preserve"> </w:t>
       </w:r>
       <w:r>
         <w:rPr>
           <w:rStyle w:val="VerbatimChar"/>
+          <w:bCs/>
+          <w:b/>
         </w:rPr>
         <w:t xml:space="preserve">#sidebar</w:t>
       </w:r>
       <w:r>
-        <w:t xml:space="preserve">: sidebar vẫn chứa các panel cũ mở bằng</w:t>
+        <w:rPr>
+          <w:bCs/>
+          <w:b/>
+        </w:rPr>
+        <w:t xml:space="preserve"> </w:t>
+      </w:r>
+      <w:r>
+        <w:rPr>
+          <w:bCs/>
+          <w:b/>
+        </w:rPr>
+        <w:t xml:space="preserve">(không gỡ được nếu không viết lại tính năng):</w:t>
+      </w:r>
+      <w:r>
+        <w:t xml:space="preserve"> </w:t>
+      </w:r>
+      <w:r>
+        <w:t xml:space="preserve">nó là container của 6 màn chức năng cũ đang chạy — Scan sổ đỏ, Quét QR, GPS thực địa, Nhập CAD/CSV, Quản lý thửa, Cắm mốc RTK — vẫn được mở từ menu Nhập sổ/Thêm qua</w:t>
       </w:r>
       <w:r>
         <w:t xml:space="preserve"> </w:t>
@@ -5713,37 +5688,16 @@
         <w:t xml:space="preserve">goLegacyTab</w:t>
       </w:r>
       <w:r>
-        <w:t xml:space="preserve"> </w:t>
-      </w:r>
-      <w:r>
-        <w:t xml:space="preserve">(quét/QR/GPS/CSV/cắm mốc) — phải chuyển từng panel sang màn mới rồi mới gỡ được. Đề xuất làm trong một đợt bảo trì riêng, mỗi panel một commit, so ảnh bằng</w:t>
-      </w:r>
-      <w:r>
-        <w:t xml:space="preserve"> </w:t>
+        <w:t xml:space="preserve">/</w:t>
       </w:r>
       <w:r>
         <w:rPr>
           <w:rStyle w:val="VerbatimChar"/>
         </w:rPr>
-        <w:t xml:space="preserve">tests/tools/shots.js</w:t>
-      </w:r>
-      <w:r>
-        <w:t xml:space="preserve"> </w:t>
-      </w:r>
-      <w:r>
-        <w:t xml:space="preserve">+</w:t>
-      </w:r>
-      <w:r>
-        <w:t xml:space="preserve"> </w:t>
-      </w:r>
-      <w:r>
-        <w:rPr>
-          <w:rStyle w:val="VerbatimChar"/>
-        </w:rPr>
-        <w:t xml:space="preserve">shotdiff.py</w:t>
-      </w:r>
-      <w:r>
-        <w:t xml:space="preserve">.</w:t>
+        <w:t xml:space="preserve">legacyTabs</w:t>
+      </w:r>
+      <w:r>
+        <w:t xml:space="preserve">. Gỡ tiếp cần quyết định sản phẩm: dựng lại từng màn trong giao diện mới (một đợt riêng, mỗi màn một commit).</w:t>
       </w:r>
     </w:p>
     <w:p>

</xml_diff>

<commit_message>
HM-08f: dựng lại màn Quản lý thửa (Dữ liệu thửa), chuyển tra địa chỉ ngoài sang ô tìm Bản đồ, gỡ tab-plots
Co-Authored-By: Claude Sonnet 5.5 <noreply@anthropic.com>
Claude-Session: https://claude.ai/code/session_016bfgvkpo5ZM5L3ZStYgd1r
</commit_message>
<xml_diff>
--- a/handover/export/TONG_KET_LANDGIS.docx
+++ b/handover/export/TONG_KET_LANDGIS.docx
@@ -5631,7 +5631,36 @@
         <w:t xml:space="preserve"> </w:t>
       </w:r>
       <w:r>
-        <w:t xml:space="preserve">+ ảnh 360/390/430) và toàn bộ phần vỏ sidebar không còn nhìn thấy (thanh tab, nút đóng, lớp phủ, nút ☰ ở header, JS đóng/mở tương ứng; thêm 24 luật CSS chết).</w:t>
+        <w:t xml:space="preserve">+ ảnh 360/390/430) và toàn bộ phần vỏ sidebar không còn nhìn thấy (thanh tab, nút đóng, lớp phủ, nút ☰ ở header, JS đóng/mở tương ứng; thêm 24 luật CSS chết). Màn</w:t>
+      </w:r>
+      <w:r>
+        <w:t xml:space="preserve"> </w:t>
+      </w:r>
+      <w:r>
+        <w:rPr>
+          <w:bCs/>
+          <w:b/>
+        </w:rPr>
+        <w:t xml:space="preserve">Quản lý thửa</w:t>
+      </w:r>
+      <w:r>
+        <w:t xml:space="preserve"> </w:t>
+      </w:r>
+      <w:r>
+        <w:t xml:space="preserve">cũ đã được dựng lại (sheet</w:t>
+      </w:r>
+      <w:r>
+        <w:t xml:space="preserve"> </w:t>
+      </w:r>
+      <w:r>
+        <w:rPr>
+          <w:iCs/>
+          <w:i/>
+        </w:rPr>
+        <w:t xml:space="preserve">Dữ liệu thửa</w:t>
+      </w:r>
+      <w:r>
+        <w:t xml:space="preserve">: thống kê, xuất 6 định dạng, dọn trùng, xoá tất cả, tham số chuyển đổi; tra địa chỉ ngoài chuyển sang ô tìm của màn Bản đồ).</w:t>
       </w:r>
       <w:r>
         <w:t xml:space="preserve"> </w:t>
@@ -5659,24 +5688,10 @@
         <w:t xml:space="preserve">#sidebar</w:t>
       </w:r>
       <w:r>
-        <w:rPr>
-          <w:bCs/>
-          <w:b/>
-        </w:rPr>
         <w:t xml:space="preserve"> </w:t>
       </w:r>
       <w:r>
-        <w:rPr>
-          <w:bCs/>
-          <w:b/>
-        </w:rPr>
-        <w:t xml:space="preserve">(không gỡ được nếu không viết lại tính năng):</w:t>
-      </w:r>
-      <w:r>
-        <w:t xml:space="preserve"> </w:t>
-      </w:r>
-      <w:r>
-        <w:t xml:space="preserve">nó là container của 6 màn chức năng cũ đang chạy — Scan sổ đỏ, Quét QR, GPS thực địa, Nhập CAD/CSV, Quản lý thửa, Cắm mốc RTK — vẫn được mở từ menu Nhập sổ/Thêm qua</w:t>
+        <w:t xml:space="preserve">vì nó là container của 5 màn chức năng cũ đang chạy — Scan sổ đỏ, Quét QR, GPS thực địa, Nhập CAD/CSV, Cắm mốc RTK — vẫn được mở từ menu Nhập sổ/Thêm qua</w:t>
       </w:r>
       <w:r>
         <w:t xml:space="preserve"> </w:t>

</xml_diff>

<commit_message>
HM-08f: dựng lại màn Nhập CAD/CSV trong giao diện mới, gỡ tab-import
Co-Authored-By: Claude Sonnet 5.5 <noreply@anthropic.com>
Claude-Session: https://claude.ai/code/session_016bfgvkpo5ZM5L3ZStYgd1r
</commit_message>
<xml_diff>
--- a/handover/export/TONG_KET_LANDGIS.docx
+++ b/handover/export/TONG_KET_LANDGIS.docx
@@ -5660,7 +5660,23 @@
         <w:t xml:space="preserve">Dữ liệu thửa</w:t>
       </w:r>
       <w:r>
-        <w:t xml:space="preserve">: thống kê, xuất 6 định dạng, dọn trùng, xoá tất cả, tham số chuyển đổi; tra địa chỉ ngoài chuyển sang ô tìm của màn Bản đồ).</w:t>
+        <w:t xml:space="preserve">: thống kê, xuất 6 định dạng, dọn trùng, xoá tất cả, tham số chuyển đổi; tra địa chỉ ngoài chuyển sang ô tìm của màn Bản đồ). Màn</w:t>
+      </w:r>
+      <w:r>
+        <w:t xml:space="preserve"> </w:t>
+      </w:r>
+      <w:r>
+        <w:rPr>
+          <w:bCs/>
+          <w:b/>
+        </w:rPr>
+        <w:t xml:space="preserve">Nhập CAD/CSV</w:t>
+      </w:r>
+      <w:r>
+        <w:t xml:space="preserve"> </w:t>
+      </w:r>
+      <w:r>
+        <w:t xml:space="preserve">cũng đã dựng lại thành sheet (chọn tỉnh/KTT ngay trên màn; file .dxf/.csv/.geojson/.kml/.txt; dán toạ độ).</w:t>
       </w:r>
       <w:r>
         <w:t xml:space="preserve"> </w:t>
@@ -5691,7 +5707,7 @@
         <w:t xml:space="preserve"> </w:t>
       </w:r>
       <w:r>
-        <w:t xml:space="preserve">vì nó là container của 5 màn chức năng cũ đang chạy — Scan sổ đỏ, Quét QR, GPS thực địa, Nhập CAD/CSV, Cắm mốc RTK — vẫn được mở từ menu Nhập sổ/Thêm qua</w:t>
+        <w:t xml:space="preserve">vì nó là container của 4 màn chức năng cũ đang chạy — Scan sổ đỏ, Quét QR, GPS thực địa, Cắm mốc RTK — vẫn được mở từ menu Nhập sổ/Thêm qua</w:t>
       </w:r>
       <w:r>
         <w:t xml:space="preserve"> </w:t>

</xml_diff>

<commit_message>
HM-08f: dựng lại màn GPS thực địa trong giao diện mới, gỡ tab-gps-offline
Co-Authored-By: Claude Sonnet 5.5 <noreply@anthropic.com>
Claude-Session: https://claude.ai/code/session_016bfgvkpo5ZM5L3ZStYgd1r
</commit_message>
<xml_diff>
--- a/handover/export/TONG_KET_LANDGIS.docx
+++ b/handover/export/TONG_KET_LANDGIS.docx
@@ -5676,7 +5676,23 @@
         <w:t xml:space="preserve"> </w:t>
       </w:r>
       <w:r>
-        <w:t xml:space="preserve">cũng đã dựng lại thành sheet (chọn tỉnh/KTT ngay trên màn; file .dxf/.csv/.geojson/.kml/.txt; dán toạ độ).</w:t>
+        <w:t xml:space="preserve">cũng đã dựng lại thành sheet (chọn tỉnh/KTT ngay trên màn; file .dxf/.csv/.geojson/.kml/.txt; dán toạ độ). Màn</w:t>
+      </w:r>
+      <w:r>
+        <w:t xml:space="preserve"> </w:t>
+      </w:r>
+      <w:r>
+        <w:rPr>
+          <w:bCs/>
+          <w:b/>
+        </w:rPr>
+        <w:t xml:space="preserve">GPS thực địa</w:t>
+      </w:r>
+      <w:r>
+        <w:t xml:space="preserve"> </w:t>
+      </w:r>
+      <w:r>
+        <w:t xml:space="preserve">cũng đã dựng lại thành sheet (định vị + nhập mốc tay → vẽ thửa).</w:t>
       </w:r>
       <w:r>
         <w:t xml:space="preserve"> </w:t>
@@ -5707,7 +5723,7 @@
         <w:t xml:space="preserve"> </w:t>
       </w:r>
       <w:r>
-        <w:t xml:space="preserve">vì nó là container của 4 màn chức năng cũ đang chạy — Scan sổ đỏ, Quét QR, GPS thực địa, Cắm mốc RTK — vẫn được mở từ menu Nhập sổ/Thêm qua</w:t>
+        <w:t xml:space="preserve">vì nó là container của 3 màn chức năng cũ đang chạy — Scan sổ đỏ, Quét QR, Cắm mốc RTK — vẫn được mở từ menu Nhập sổ/Thêm qua</w:t>
       </w:r>
       <w:r>
         <w:t xml:space="preserve"> </w:t>

</xml_diff>

<commit_message>
HM-08f: dựng lại màn Cắm mốc RTK trong giao diện mới, gỡ tab-stakeout
Co-Authored-By: Claude Sonnet 5.5 <noreply@anthropic.com>
Claude-Session: https://claude.ai/code/session_016bfgvkpo5ZM5L3ZStYgd1r
</commit_message>
<xml_diff>
--- a/handover/export/TONG_KET_LANDGIS.docx
+++ b/handover/export/TONG_KET_LANDGIS.docx
@@ -5692,7 +5692,23 @@
         <w:t xml:space="preserve"> </w:t>
       </w:r>
       <w:r>
-        <w:t xml:space="preserve">cũng đã dựng lại thành sheet (định vị + nhập mốc tay → vẽ thửa).</w:t>
+        <w:t xml:space="preserve">cũng đã dựng lại thành sheet (định vị + nhập mốc tay → vẽ thửa). Màn</w:t>
+      </w:r>
+      <w:r>
+        <w:t xml:space="preserve"> </w:t>
+      </w:r>
+      <w:r>
+        <w:rPr>
+          <w:bCs/>
+          <w:b/>
+        </w:rPr>
+        <w:t xml:space="preserve">Cắm mốc RTK</w:t>
+      </w:r>
+      <w:r>
+        <w:t xml:space="preserve"> </w:t>
+      </w:r>
+      <w:r>
+        <w:t xml:space="preserve">cũng đã dựng lại thành sheet (sửa luôn lỗi cũ: đổi thửa không cập nhật danh sách mốc; đóng màn tự tắt GPS).</w:t>
       </w:r>
       <w:r>
         <w:t xml:space="preserve"> </w:t>
@@ -5723,7 +5739,7 @@
         <w:t xml:space="preserve"> </w:t>
       </w:r>
       <w:r>
-        <w:t xml:space="preserve">vì nó là container của 3 màn chức năng cũ đang chạy — Scan sổ đỏ, Quét QR, Cắm mốc RTK — vẫn được mở từ menu Nhập sổ/Thêm qua</w:t>
+        <w:t xml:space="preserve">vì nó là container của 2 màn chức năng cũ đang chạy — Scan sổ đỏ (camera + AI) và Quét QR — vẫn được mở từ menu Nhập sổ/Thêm qua</w:t>
       </w:r>
       <w:r>
         <w:t xml:space="preserve"> </w:t>

</xml_diff>

<commit_message>
HM-08f: dựng lại màn Quét QR trong giao diện mới, gỡ tab-qr
Co-Authored-By: Claude Sonnet 5.5 <noreply@anthropic.com>
Claude-Session: https://claude.ai/code/session_016bfgvkpo5ZM5L3ZStYgd1r
</commit_message>
<xml_diff>
--- a/handover/export/TONG_KET_LANDGIS.docx
+++ b/handover/export/TONG_KET_LANDGIS.docx
@@ -5708,7 +5708,23 @@
         <w:t xml:space="preserve"> </w:t>
       </w:r>
       <w:r>
-        <w:t xml:space="preserve">cũng đã dựng lại thành sheet (sửa luôn lỗi cũ: đổi thửa không cập nhật danh sách mốc; đóng màn tự tắt GPS).</w:t>
+        <w:t xml:space="preserve">cũng đã dựng lại thành sheet (sửa luôn lỗi cũ: đổi thửa không cập nhật danh sách mốc; đóng màn tự tắt GPS). Màn</w:t>
+      </w:r>
+      <w:r>
+        <w:t xml:space="preserve"> </w:t>
+      </w:r>
+      <w:r>
+        <w:rPr>
+          <w:bCs/>
+          <w:b/>
+        </w:rPr>
+        <w:t xml:space="preserve">Quét QR</w:t>
+      </w:r>
+      <w:r>
+        <w:t xml:space="preserve"> </w:t>
+      </w:r>
+      <w:r>
+        <w:t xml:space="preserve">cũng đã dựng lại thành sheet (quét ảnh/camera, lịch sử, tra cứu; đóng màn tắt camera).</w:t>
       </w:r>
       <w:r>
         <w:t xml:space="preserve"> </w:t>
@@ -5739,7 +5755,19 @@
         <w:t xml:space="preserve"> </w:t>
       </w:r>
       <w:r>
-        <w:t xml:space="preserve">vì nó là container của 2 màn chức năng cũ đang chạy — Scan sổ đỏ (camera + AI) và Quét QR — vẫn được mở từ menu Nhập sổ/Thêm qua</w:t>
+        <w:t xml:space="preserve">vì nó còn chứa 1 màn chức năng cũ đang chạy — Scan sổ đỏ (camera + AI,</w:t>
+      </w:r>
+      <w:r>
+        <w:t xml:space="preserve"> </w:t>
+      </w:r>
+      <w:r>
+        <w:rPr>
+          <w:rStyle w:val="VerbatimChar"/>
+        </w:rPr>
+        <w:t xml:space="preserve">#tab-scan-ai</w:t>
+      </w:r>
+      <w:r>
+        <w:t xml:space="preserve">) — vẫn được mở từ menu Nhập sổ/Thêm qua</w:t>
       </w:r>
       <w:r>
         <w:t xml:space="preserve"> </w:t>

</xml_diff>

<commit_message>
HM-08f: gỡ hệ tab sidebar (switchTab); sidebar chỉ còn màn Scan sổ đỏ
Co-Authored-By: Claude Sonnet 5.5 <noreply@anthropic.com>
Claude-Session: https://claude.ai/code/session_016bfgvkpo5ZM5L3ZStYgd1r
</commit_message>
<xml_diff>
--- a/handover/export/TONG_KET_LANDGIS.docx
+++ b/handover/export/TONG_KET_LANDGIS.docx
@@ -5724,7 +5724,16 @@
         <w:t xml:space="preserve"> </w:t>
       </w:r>
       <w:r>
-        <w:t xml:space="preserve">cũng đã dựng lại thành sheet (quét ảnh/camera, lịch sử, tra cứu; đóng màn tắt camera).</w:t>
+        <w:t xml:space="preserve">cũng đã dựng lại thành sheet (quét ảnh/camera, lịch sử, tra cứu; đóng màn tắt camera). Hệ tab của sidebar đã gỡ (</w:t>
+      </w:r>
+      <w:r>
+        <w:rPr>
+          <w:rStyle w:val="VerbatimChar"/>
+        </w:rPr>
+        <w:t xml:space="preserve">switchTab</w:t>
+      </w:r>
+      <w:r>
+        <w:t xml:space="preserve">); sidebar nay chỉ còn</w:t>
       </w:r>
       <w:r>
         <w:t xml:space="preserve"> </w:t>
@@ -5734,28 +5743,53 @@
           <w:bCs/>
           <w:b/>
         </w:rPr>
-        <w:t xml:space="preserve">Còn giữ</w:t>
+        <w:t xml:space="preserve">một màn: Scan sổ đỏ</w:t>
+      </w:r>
+      <w:r>
+        <w:t xml:space="preserve"> </w:t>
+      </w:r>
+      <w:r>
+        <w:t xml:space="preserve">(</w:t>
+      </w:r>
+      <w:r>
+        <w:rPr>
+          <w:rStyle w:val="VerbatimChar"/>
+        </w:rPr>
+        <w:t xml:space="preserve">#tab-scan-ai</w:t>
+      </w:r>
+      <w:r>
+        <w:t xml:space="preserve">, 31 id: ảnh, khoanh vùng, AI, kiểm khép kín, bình sai, chọn tỉnh toàn cục — nhiều lớp mã gắn vào, và</w:t>
+      </w:r>
+      <w:r>
+        <w:t xml:space="preserve"> </w:t>
+      </w:r>
+      <w:r>
+        <w:rPr>
+          <w:rStyle w:val="VerbatimChar"/>
+        </w:rPr>
+        <w:t xml:space="preserve">#sidebar</w:t>
+      </w:r>
+      <w:r>
+        <w:t xml:space="preserve"> </w:t>
+      </w:r>
+      <w:r>
+        <w:t xml:space="preserve">còn là khung màn nhập liệu cho 68 luật CSS cùng các vòng tự phục hồi).</w:t>
+      </w:r>
+      <w:r>
+        <w:t xml:space="preserve"> </w:t>
       </w:r>
       <w:r>
         <w:rPr>
           <w:bCs/>
           <w:b/>
         </w:rPr>
+        <w:t xml:space="preserve">Chưa dựng lại màn Scan</w:t>
+      </w:r>
+      <w:r>
         <w:t xml:space="preserve"> </w:t>
       </w:r>
       <w:r>
-        <w:rPr>
-          <w:rStyle w:val="VerbatimChar"/>
-          <w:bCs/>
-          <w:b/>
-        </w:rPr>
-        <w:t xml:space="preserve">#sidebar</w:t>
-      </w:r>
-      <w:r>
-        <w:t xml:space="preserve"> </w:t>
-      </w:r>
-      <w:r>
-        <w:t xml:space="preserve">vì nó còn chứa 1 màn chức năng cũ đang chạy — Scan sổ đỏ (camera + AI,</w:t>
+        <w:t xml:space="preserve">— cần quyết định: (A) giữ màn, chỉ đổi khung/tên; (B) viết lại luồng chụp → khoanh vùng → AI → kiểm khép kín thành bước 2 của luồng Nhập sổ rồi gỡ</w:t>
       </w:r>
       <w:r>
         <w:t xml:space="preserve"> </w:t>
@@ -5764,10 +5798,25 @@
         <w:rPr>
           <w:rStyle w:val="VerbatimChar"/>
         </w:rPr>
-        <w:t xml:space="preserve">#tab-scan-ai</w:t>
-      </w:r>
-      <w:r>
-        <w:t xml:space="preserve">) — vẫn được mở từ menu Nhập sổ/Thêm qua</w:t>
+        <w:t xml:space="preserve">#sidebar</w:t>
+      </w:r>
+      <w:r>
+        <w:t xml:space="preserve">. Hiện</w:t>
+      </w:r>
+      <w:r>
+        <w:t xml:space="preserve"> </w:t>
+      </w:r>
+      <w:r>
+        <w:rPr>
+          <w:rStyle w:val="VerbatimChar"/>
+        </w:rPr>
+        <w:t xml:space="preserve">#sidebar</w:t>
+      </w:r>
+      <w:r>
+        <w:t xml:space="preserve"> </w:t>
+      </w:r>
+      <w:r>
+        <w:t xml:space="preserve">giữ vì vẫn được mở từ menu Nhập sổ/Thêm qua</w:t>
       </w:r>
       <w:r>
         <w:t xml:space="preserve"> </w:t>

</xml_diff>

<commit_message>
HM-08f hướng A: khung màn Scan sổ đỏ (đầu trang, 3 bước, tuỳ chọn gập), giữ nguyên logic
Co-Authored-By: Claude Sonnet 5.5 <noreply@anthropic.com>
Claude-Session: https://claude.ai/code/session_016bfgvkpo5ZM5L3ZStYgd1r
</commit_message>
<xml_diff>
--- a/handover/export/TONG_KET_LANDGIS.docx
+++ b/handover/export/TONG_KET_LANDGIS.docx
@@ -5773,7 +5773,7 @@
         <w:t xml:space="preserve"> </w:t>
       </w:r>
       <w:r>
-        <w:t xml:space="preserve">còn là khung màn nhập liệu cho 68 luật CSS cùng các vòng tự phục hồi).</w:t>
+        <w:t xml:space="preserve">còn là khung màn nhập liệu cho 68 luật CSS cùng các vòng tự phục hồi). Màn Scan đã làm</w:t>
       </w:r>
       <w:r>
         <w:t xml:space="preserve"> </w:t>
@@ -5783,13 +5783,29 @@
           <w:bCs/>
           <w:b/>
         </w:rPr>
-        <w:t xml:space="preserve">Chưa dựng lại màn Scan</w:t>
-      </w:r>
-      <w:r>
-        <w:t xml:space="preserve"> </w:t>
-      </w:r>
-      <w:r>
-        <w:t xml:space="preserve">— cần quyết định: (A) giữ màn, chỉ đổi khung/tên; (B) viết lại luồng chụp → khoanh vùng → AI → kiểm khép kín thành bước 2 của luồng Nhập sổ rồi gỡ</w:t>
+        <w:t xml:space="preserve">hướng A</w:t>
+      </w:r>
+      <w:r>
+        <w:t xml:space="preserve"> </w:t>
+      </w:r>
+      <w:r>
+        <w:t xml:space="preserve">(đầu trang + 3 bước, tuỳ chọn gập, giữ nguyên logic).</w:t>
+      </w:r>
+      <w:r>
+        <w:t xml:space="preserve"> </w:t>
+      </w:r>
+      <w:r>
+        <w:rPr>
+          <w:bCs/>
+          <w:b/>
+        </w:rPr>
+        <w:t xml:space="preserve">Hướng B</w:t>
+      </w:r>
+      <w:r>
+        <w:t xml:space="preserve"> </w:t>
+      </w:r>
+      <w:r>
+        <w:t xml:space="preserve">(viết lại luồng chụp → khoanh vùng → AI → kiểm khép kín thành bước 2 của luồng Nhập sổ rồi gỡ</w:t>
       </w:r>
       <w:r>
         <w:t xml:space="preserve"> </w:t>
@@ -5801,7 +5817,7 @@
         <w:t xml:space="preserve">#sidebar</w:t>
       </w:r>
       <w:r>
-        <w:t xml:space="preserve">. Hiện</w:t>
+        <w:t xml:space="preserve">) chưa làm, chờ bạn thử camera/AI trên máy thật. Hiện</w:t>
       </w:r>
       <w:r>
         <w:t xml:space="preserve"> </w:t>

</xml_diff>

<commit_message>
HM-08f hướng B: bỏ màn Nhập liệu/sidebar, app luôn ở Bản đồ, Scan sổ đỏ thành lớp toàn màn
Co-Authored-By: Claude Sonnet 5.5 <noreply@anthropic.com>
Claude-Session: https://claude.ai/code/session_016bfgvkpo5ZM5L3ZStYgd1r
</commit_message>
<xml_diff>
--- a/handover/export/TONG_KET_LANDGIS.docx
+++ b/handover/export/TONG_KET_LANDGIS.docx
@@ -5586,7 +5586,7 @@
           <w:bCs/>
           <w:b/>
         </w:rPr>
-        <w:t xml:space="preserve">HM-08f (dọn CSS/sidebar):</w:t>
+        <w:t xml:space="preserve">HM-08f (dọn CSS/sidebar) — đã xong phần lớn:</w:t>
       </w:r>
       <w:r>
         <w:t xml:space="preserve"> </w:t>
@@ -5631,7 +5631,7 @@
         <w:t xml:space="preserve"> </w:t>
       </w:r>
       <w:r>
-        <w:t xml:space="preserve">+ ảnh 360/390/430) và toàn bộ phần vỏ sidebar không còn nhìn thấy (thanh tab, nút đóng, lớp phủ, nút ☰ ở header, JS đóng/mở tương ứng; thêm 24 luật CSS chết). Màn</w:t>
+        <w:t xml:space="preserve">+ ảnh 360/390/430), toàn bộ vỏ sidebar (thanh tab, drawer, backdrop, nút ☰/MENU) và dựng lại 6 màn cũ thành giao diện mới: Dữ liệu thửa, Nhập CAD/CSV, GPS thực địa, Cắm mốc RTK, Quét QR (sheet) và Scan sổ đỏ (lớp toàn màn, hướng B). App nay luôn mở ở màn Bản đồ; màn Nhập liệu riêng không còn.</w:t>
       </w:r>
       <w:r>
         <w:t xml:space="preserve"> </w:t>
@@ -5641,124 +5641,13 @@
           <w:bCs/>
           <w:b/>
         </w:rPr>
-        <w:t xml:space="preserve">Quản lý thửa</w:t>
+        <w:t xml:space="preserve">Còn lại:</w:t>
       </w:r>
       <w:r>
         <w:t xml:space="preserve"> </w:t>
       </w:r>
       <w:r>
-        <w:t xml:space="preserve">cũ đã được dựng lại (sheet</w:t>
-      </w:r>
-      <w:r>
-        <w:t xml:space="preserve"> </w:t>
-      </w:r>
-      <w:r>
-        <w:rPr>
-          <w:iCs/>
-          <w:i/>
-        </w:rPr>
-        <w:t xml:space="preserve">Dữ liệu thửa</w:t>
-      </w:r>
-      <w:r>
-        <w:t xml:space="preserve">: thống kê, xuất 6 định dạng, dọn trùng, xoá tất cả, tham số chuyển đổi; tra địa chỉ ngoài chuyển sang ô tìm của màn Bản đồ). Màn</w:t>
-      </w:r>
-      <w:r>
-        <w:t xml:space="preserve"> </w:t>
-      </w:r>
-      <w:r>
-        <w:rPr>
-          <w:bCs/>
-          <w:b/>
-        </w:rPr>
-        <w:t xml:space="preserve">Nhập CAD/CSV</w:t>
-      </w:r>
-      <w:r>
-        <w:t xml:space="preserve"> </w:t>
-      </w:r>
-      <w:r>
-        <w:t xml:space="preserve">cũng đã dựng lại thành sheet (chọn tỉnh/KTT ngay trên màn; file .dxf/.csv/.geojson/.kml/.txt; dán toạ độ). Màn</w:t>
-      </w:r>
-      <w:r>
-        <w:t xml:space="preserve"> </w:t>
-      </w:r>
-      <w:r>
-        <w:rPr>
-          <w:bCs/>
-          <w:b/>
-        </w:rPr>
-        <w:t xml:space="preserve">GPS thực địa</w:t>
-      </w:r>
-      <w:r>
-        <w:t xml:space="preserve"> </w:t>
-      </w:r>
-      <w:r>
-        <w:t xml:space="preserve">cũng đã dựng lại thành sheet (định vị + nhập mốc tay → vẽ thửa). Màn</w:t>
-      </w:r>
-      <w:r>
-        <w:t xml:space="preserve"> </w:t>
-      </w:r>
-      <w:r>
-        <w:rPr>
-          <w:bCs/>
-          <w:b/>
-        </w:rPr>
-        <w:t xml:space="preserve">Cắm mốc RTK</w:t>
-      </w:r>
-      <w:r>
-        <w:t xml:space="preserve"> </w:t>
-      </w:r>
-      <w:r>
-        <w:t xml:space="preserve">cũng đã dựng lại thành sheet (sửa luôn lỗi cũ: đổi thửa không cập nhật danh sách mốc; đóng màn tự tắt GPS). Màn</w:t>
-      </w:r>
-      <w:r>
-        <w:t xml:space="preserve"> </w:t>
-      </w:r>
-      <w:r>
-        <w:rPr>
-          <w:bCs/>
-          <w:b/>
-        </w:rPr>
-        <w:t xml:space="preserve">Quét QR</w:t>
-      </w:r>
-      <w:r>
-        <w:t xml:space="preserve"> </w:t>
-      </w:r>
-      <w:r>
-        <w:t xml:space="preserve">cũng đã dựng lại thành sheet (quét ảnh/camera, lịch sử, tra cứu; đóng màn tắt camera). Hệ tab của sidebar đã gỡ (</w:t>
-      </w:r>
-      <w:r>
-        <w:rPr>
-          <w:rStyle w:val="VerbatimChar"/>
-        </w:rPr>
-        <w:t xml:space="preserve">switchTab</w:t>
-      </w:r>
-      <w:r>
-        <w:t xml:space="preserve">); sidebar nay chỉ còn</w:t>
-      </w:r>
-      <w:r>
-        <w:t xml:space="preserve"> </w:t>
-      </w:r>
-      <w:r>
-        <w:rPr>
-          <w:bCs/>
-          <w:b/>
-        </w:rPr>
-        <w:t xml:space="preserve">một màn: Scan sổ đỏ</w:t>
-      </w:r>
-      <w:r>
-        <w:t xml:space="preserve"> </w:t>
-      </w:r>
-      <w:r>
-        <w:t xml:space="preserve">(</w:t>
-      </w:r>
-      <w:r>
-        <w:rPr>
-          <w:rStyle w:val="VerbatimChar"/>
-        </w:rPr>
-        <w:t xml:space="preserve">#tab-scan-ai</w:t>
-      </w:r>
-      <w:r>
-        <w:t xml:space="preserve">, 31 id: ảnh, khoanh vùng, AI, kiểm khép kín, bình sai, chọn tỉnh toàn cục — nhiều lớp mã gắn vào, và</w:t>
+        <w:t xml:space="preserve">id</w:t>
       </w:r>
       <w:r>
         <w:t xml:space="preserve"> </w:t>
@@ -5773,39 +5662,7 @@
         <w:t xml:space="preserve"> </w:t>
       </w:r>
       <w:r>
-        <w:t xml:space="preserve">còn là khung màn nhập liệu cho 68 luật CSS cùng các vòng tự phục hồi). Màn Scan đã làm</w:t>
-      </w:r>
-      <w:r>
-        <w:t xml:space="preserve"> </w:t>
-      </w:r>
-      <w:r>
-        <w:rPr>
-          <w:bCs/>
-          <w:b/>
-        </w:rPr>
-        <w:t xml:space="preserve">hướng A</w:t>
-      </w:r>
-      <w:r>
-        <w:t xml:space="preserve"> </w:t>
-      </w:r>
-      <w:r>
-        <w:t xml:space="preserve">(đầu trang + 3 bước, tuỳ chọn gập, giữ nguyên logic).</w:t>
-      </w:r>
-      <w:r>
-        <w:t xml:space="preserve"> </w:t>
-      </w:r>
-      <w:r>
-        <w:rPr>
-          <w:bCs/>
-          <w:b/>
-        </w:rPr>
-        <w:t xml:space="preserve">Hướng B</w:t>
-      </w:r>
-      <w:r>
-        <w:t xml:space="preserve"> </w:t>
-      </w:r>
-      <w:r>
-        <w:t xml:space="preserve">(viết lại luồng chụp → khoanh vùng → AI → kiểm khép kín thành bước 2 của luồng Nhập sổ rồi gỡ</w:t>
+        <w:t xml:space="preserve">được giữ cho lớp Scan sổ đỏ (65 luật CSS chữ/nút khoá theo id); chưa nối ảnh/camera vào bước 2 của luồng Nhập sổ 3 bước; các vòng tự phục hồi lg62/v111 và nút</w:t>
       </w:r>
       <w:r>
         <w:t xml:space="preserve"> </w:t>
@@ -5814,46 +5671,13 @@
         <w:rPr>
           <w:rStyle w:val="VerbatimChar"/>
         </w:rPr>
-        <w:t xml:space="preserve">#sidebar</w:t>
-      </w:r>
-      <w:r>
-        <w:t xml:space="preserve">) chưa làm, chờ bạn thử camera/AI trên máy thật. Hiện</w:t>
+        <w:t xml:space="preserve">#lg62-back/next</w:t>
       </w:r>
       <w:r>
         <w:t xml:space="preserve"> </w:t>
       </w:r>
       <w:r>
-        <w:rPr>
-          <w:rStyle w:val="VerbatimChar"/>
-        </w:rPr>
-        <w:t xml:space="preserve">#sidebar</w:t>
-      </w:r>
-      <w:r>
-        <w:t xml:space="preserve"> </w:t>
-      </w:r>
-      <w:r>
-        <w:t xml:space="preserve">giữ vì vẫn được mở từ menu Nhập sổ/Thêm qua</w:t>
-      </w:r>
-      <w:r>
-        <w:t xml:space="preserve"> </w:t>
-      </w:r>
-      <w:r>
-        <w:rPr>
-          <w:rStyle w:val="VerbatimChar"/>
-        </w:rPr>
-        <w:t xml:space="preserve">goLegacyTab</w:t>
-      </w:r>
-      <w:r>
-        <w:t xml:space="preserve">/</w:t>
-      </w:r>
-      <w:r>
-        <w:rPr>
-          <w:rStyle w:val="VerbatimChar"/>
-        </w:rPr>
-        <w:t xml:space="preserve">legacyTabs</w:t>
-      </w:r>
-      <w:r>
-        <w:t xml:space="preserve">. Gỡ tiếp cần quyết định sản phẩm: dựng lại từng màn trong giao diện mới (một đợt riêng, mỗi màn một commit).</w:t>
+        <w:t xml:space="preserve">đã vô hiệu nhưng chưa xoá mã; chưa có màn chào khi chưa có thửa. Chuẩn đo nạp 50 thửa đổi sang DOMContentLoaded ≤ 2 s (load ≤ 6 s) vì bản đồ hiện ngay lúc mở.</w:t>
       </w:r>
     </w:p>
     <w:p>

</xml_diff>

<commit_message>
P07: đóng phiên — tổng kết, bàn giao, ZIP tiến độ
Co-Authored-By: Claude Sonnet 5.5 <noreply@anthropic.com>
Claude-Session: https://claude.ai/code/session_01SkwQ3cwS7GRmmnPqAbVswr
</commit_message>
<xml_diff>
--- a/handover/export/TONG_KET_LANDGIS.docx
+++ b/handover/export/TONG_KET_LANDGIS.docx
@@ -5693,6 +5693,28 @@
           <w:bCs/>
           <w:b/>
         </w:rPr>
+        <w:t xml:space="preserve">HM-08f hướng B — hoàn tất ở P07:</w:t>
+      </w:r>
+      <w:r>
+        <w:t xml:space="preserve"> </w:t>
+      </w:r>
+      <w:r>
+        <w:t xml:space="preserve">ảnh/camera nằm ngay bước 1 luồng Nhập sổ (AI điền sẵn, số &lt;90% tô vàng, lỗi báo rõ, không tự tạo thửa); đã gỡ vòng tự phục hồi sidebar/lg111, #lg62-back/next/steps, auto-chuyển bản đồ, popstate; màn chào 3 lối vào khi chưa có thửa. Việc còn lại: thử camera + AI trên máy thật.</w:t>
+      </w:r>
+    </w:p>
+    <w:p>
+      <w:pPr>
+        <w:numPr>
+          <w:ilvl w:val="0"/>
+          <w:numId w:val="1001"/>
+        </w:numPr>
+        <w:pStyle w:val="Compact"/>
+      </w:pPr>
+      <w:r>
+        <w:rPr>
+          <w:bCs/>
+          <w:b/>
+        </w:rPr>
         <w:t xml:space="preserve">drawPlot từ chối</w:t>
       </w:r>
       <w:r>
@@ -6486,6 +6508,44 @@
             </w:pPr>
             <w:r>
               <w:t xml:space="preserve">HM-18a, HM-18b, HM-19, HM-20, HM-22(CHO_NGUOI_DUNG), HM-25(CHO_NGUOI_DUNG), HM-28(CHO_NGUOI_DUNG), HM-08f(một phần: CSS chết)</w:t>
+            </w:r>
+          </w:p>
+        </w:tc>
+      </w:tr>
+      <w:tr>
+        <w:tc>
+          <w:tcPr/>
+          <w:p>
+            <w:pPr>
+              <w:pStyle w:val="Compact"/>
+              <w:jc w:val="left"/>
+            </w:pPr>
+            <w:r>
+              <w:t xml:space="preserve">P07</w:t>
+            </w:r>
+          </w:p>
+        </w:tc>
+        <w:tc>
+          <w:tcPr/>
+          <w:p>
+            <w:pPr>
+              <w:pStyle w:val="Compact"/>
+              <w:jc w:val="left"/>
+            </w:pPr>
+            <w:r>
+              <w:t xml:space="preserve">session_01SkwQ3cwS7GRmmnPqAbVswr</w:t>
+            </w:r>
+          </w:p>
+        </w:tc>
+        <w:tc>
+          <w:tcPr/>
+          <w:p>
+            <w:pPr>
+              <w:pStyle w:val="Compact"/>
+              <w:jc w:val="left"/>
+            </w:pPr>
+            <w:r>
+              <w:t xml:space="preserve">HM-08f (hướng B hoàn tất: ảnh vào wizard, dọn mã chết, màn chào)</w:t>
             </w:r>
           </w:p>
         </w:tc>

</xml_diff>

<commit_message>
P08: đóng phiên — HM-46d xong, tổng kết, bàn giao, ZIP tiến độ P08; chuỗi kết thúc
Co-Authored-By: Claude Opus 5.5 <noreply@anthropic.com>
Claude-Session: https://claude.ai/code/session_01CbedJka1VDEMyXGXEcyohq
</commit_message>
<xml_diff>
--- a/handover/export/TONG_KET_LANDGIS.docx
+++ b/handover/export/TONG_KET_LANDGIS.docx
@@ -2,13 +2,13 @@
 <file path=word/document.xml><?xml version="1.0" encoding="utf-8"?>
 <w:document xmlns:w="http://schemas.openxmlformats.org/wordprocessingml/2006/main" xmlns:m="http://schemas.openxmlformats.org/officeDocument/2006/math" xmlns:r="http://schemas.openxmlformats.org/officeDocument/2006/relationships" xmlns:o="urn:schemas-microsoft-com:office:office" xmlns:v="urn:schemas-microsoft-com:vml" xmlns:w10="urn:schemas-microsoft-com:office:word" xmlns:a="http://schemas.openxmlformats.org/drawingml/2006/main" xmlns:pic="http://schemas.openxmlformats.org/drawingml/2006/picture" xmlns:wp="http://schemas.openxmlformats.org/drawingml/2006/wordprocessingDrawing">
   <w:body>
-    <w:bookmarkStart w:id="28" w:name="Xe4be18d8619cab23e6f6b4df0fe189864846926"/>
+    <w:bookmarkStart w:id="28" w:name="X49ff1726c8a9c2fa47e764188a20d258208b7aa"/>
     <w:p>
       <w:pPr>
         <w:pStyle w:val="Heading1"/>
       </w:pPr>
       <w:r>
-        <w:t xml:space="preserve">TỔNG KẾT ĐỀ ÁN LANDGIS v1.8 — chuỗi tự động P02–P06 (15/10/2026)</w:t>
+        <w:t xml:space="preserve">TỔNG KẾT ĐỀ ÁN LANDGIS v1.8 — chuỗi tự động P02–P08 (15–16/10/2026)</w:t>
       </w:r>
     </w:p>
     <w:p>
@@ -155,7 +155,7 @@
               <w:jc w:val="left"/>
             </w:pPr>
             <w:r>
-              <w:t xml:space="preserve">58</w:t>
+              <w:t xml:space="preserve">62</w:t>
             </w:r>
           </w:p>
         </w:tc>
@@ -3826,6 +3826,206 @@
           </w:p>
         </w:tc>
       </w:tr>
+      <w:tr>
+        <w:tc>
+          <w:tcPr/>
+          <w:p>
+            <w:pPr>
+              <w:pStyle w:val="Compact"/>
+              <w:jc w:val="left"/>
+            </w:pPr>
+            <w:r>
+              <w:t xml:space="preserve">HM-46a</w:t>
+            </w:r>
+          </w:p>
+        </w:tc>
+        <w:tc>
+          <w:tcPr/>
+          <w:p>
+            <w:pPr>
+              <w:pStyle w:val="Compact"/>
+              <w:jc w:val="left"/>
+            </w:pPr>
+            <w:r>
+              <w:t xml:space="preserve">Thông báo 1 dòng + chip tiến độ hồ sơ</w:t>
+            </w:r>
+          </w:p>
+        </w:tc>
+        <w:tc>
+          <w:tcPr/>
+          <w:p>
+            <w:pPr>
+              <w:pStyle w:val="Compact"/>
+              <w:jc w:val="left"/>
+            </w:pPr>
+            <w:r>
+              <w:t xml:space="preserve">DAT_V3</w:t>
+            </w:r>
+          </w:p>
+        </w:tc>
+        <w:tc>
+          <w:tcPr/>
+          <w:p>
+            <w:pPr>
+              <w:pStyle w:val="Compact"/>
+              <w:jc w:val="left"/>
+            </w:pPr>
+            <w:r>
+              <w:t xml:space="preserve">tests/regress/hm46a_snack.js</w:t>
+            </w:r>
+          </w:p>
+        </w:tc>
+      </w:tr>
+      <w:tr>
+        <w:tc>
+          <w:tcPr/>
+          <w:p>
+            <w:pPr>
+              <w:pStyle w:val="Compact"/>
+              <w:jc w:val="left"/>
+            </w:pPr>
+            <w:r>
+              <w:t xml:space="preserve">HM-46b</w:t>
+            </w:r>
+          </w:p>
+        </w:tc>
+        <w:tc>
+          <w:tcPr/>
+          <w:p>
+            <w:pPr>
+              <w:pStyle w:val="Compact"/>
+              <w:jc w:val="left"/>
+            </w:pPr>
+            <w:r>
+              <w:t xml:space="preserve">Bản đồ: 4 vùng cố định</w:t>
+            </w:r>
+          </w:p>
+        </w:tc>
+        <w:tc>
+          <w:tcPr/>
+          <w:p>
+            <w:pPr>
+              <w:pStyle w:val="Compact"/>
+              <w:jc w:val="left"/>
+            </w:pPr>
+            <w:r>
+              <w:t xml:space="preserve">DAT_V3</w:t>
+            </w:r>
+          </w:p>
+        </w:tc>
+        <w:tc>
+          <w:tcPr/>
+          <w:p>
+            <w:pPr>
+              <w:pStyle w:val="Compact"/>
+              <w:jc w:val="left"/>
+            </w:pPr>
+            <w:r>
+              <w:t xml:space="preserve">tests/regress/hm46b_map.js</w:t>
+            </w:r>
+          </w:p>
+        </w:tc>
+      </w:tr>
+      <w:tr>
+        <w:tc>
+          <w:tcPr/>
+          <w:p>
+            <w:pPr>
+              <w:pStyle w:val="Compact"/>
+              <w:jc w:val="left"/>
+            </w:pPr>
+            <w:r>
+              <w:t xml:space="preserve">HM-46c</w:t>
+            </w:r>
+          </w:p>
+        </w:tc>
+        <w:tc>
+          <w:tcPr/>
+          <w:p>
+            <w:pPr>
+              <w:pStyle w:val="Compact"/>
+              <w:jc w:val="left"/>
+            </w:pPr>
+            <w:r>
+              <w:t xml:space="preserve">Nhập sổ, Hồ sơ, Thửa, màn chào theo mockup</w:t>
+            </w:r>
+          </w:p>
+        </w:tc>
+        <w:tc>
+          <w:tcPr/>
+          <w:p>
+            <w:pPr>
+              <w:pStyle w:val="Compact"/>
+              <w:jc w:val="left"/>
+            </w:pPr>
+            <w:r>
+              <w:t xml:space="preserve">DAT_V3</w:t>
+            </w:r>
+          </w:p>
+        </w:tc>
+        <w:tc>
+          <w:tcPr/>
+          <w:p>
+            <w:pPr>
+              <w:pStyle w:val="Compact"/>
+              <w:jc w:val="left"/>
+            </w:pPr>
+            <w:r>
+              <w:t xml:space="preserve">tests/regress/hm46c_sheets.js</w:t>
+            </w:r>
+          </w:p>
+        </w:tc>
+      </w:tr>
+      <w:tr>
+        <w:tc>
+          <w:tcPr/>
+          <w:p>
+            <w:pPr>
+              <w:pStyle w:val="Compact"/>
+              <w:jc w:val="left"/>
+            </w:pPr>
+            <w:r>
+              <w:t xml:space="preserve">HM-46d</w:t>
+            </w:r>
+          </w:p>
+        </w:tc>
+        <w:tc>
+          <w:tcPr/>
+          <w:p>
+            <w:pPr>
+              <w:pStyle w:val="Compact"/>
+              <w:jc w:val="left"/>
+            </w:pPr>
+            <w:r>
+              <w:t xml:space="preserve">Gom CSS: 6 tầng z-index + thang chữ/khoảng cách</w:t>
+            </w:r>
+          </w:p>
+        </w:tc>
+        <w:tc>
+          <w:tcPr/>
+          <w:p>
+            <w:pPr>
+              <w:pStyle w:val="Compact"/>
+              <w:jc w:val="left"/>
+            </w:pPr>
+            <w:r>
+              <w:t xml:space="preserve">DAT_V3</w:t>
+            </w:r>
+          </w:p>
+        </w:tc>
+        <w:tc>
+          <w:tcPr/>
+          <w:p>
+            <w:pPr>
+              <w:pStyle w:val="Compact"/>
+              <w:jc w:val="left"/>
+            </w:pPr>
+            <w:r>
+              <w:t xml:space="preserve">tests/regress/hm46d_css.js, tests/regress/hm46d_welcome.js, tests/tools/zprobe.js, tests/t</w:t>
+            </w:r>
+          </w:p>
+        </w:tc>
+      </w:tr>
     </w:tbl>
     <w:bookmarkEnd w:id="21"/>
     <w:bookmarkStart w:id="22" w:name="Xcf646562e839447978ce478ad33fa7aa1daf737"/>
@@ -5715,6 +5915,128 @@
           <w:bCs/>
           <w:b/>
         </w:rPr>
+        <w:t xml:space="preserve">HM-46 (giao diện điện thoại, P07–P08) — hoàn tất, một tiêu chí chưa đạt:</w:t>
+      </w:r>
+      <w:r>
+        <w:t xml:space="preserve"> </w:t>
+      </w:r>
+      <w:r>
+        <w:t xml:space="preserve">HM-46a thông báo 1 dòng + chip tiến độ; HM-46b bản đồ 4 vùng cố định; HM-46c tấm Nhập sổ/Thửa/Hồ sơ theo mockup, dock SVG; HM-46d thang tầng chồng 15 biến</w:t>
+      </w:r>
+      <w:r>
+        <w:t xml:space="preserve"> </w:t>
+      </w:r>
+      <w:r>
+        <w:rPr>
+          <w:rStyle w:val="VerbatimChar"/>
+        </w:rPr>
+        <w:t xml:space="preserve">--z-*</w:t>
+      </w:r>
+      <w:r>
+        <w:t xml:space="preserve"> </w:t>
+      </w:r>
+      <w:r>
+        <w:t xml:space="preserve">(z-index khác nhau 51 → 20, kiểm bằng</w:t>
+      </w:r>
+      <w:r>
+        <w:t xml:space="preserve"> </w:t>
+      </w:r>
+      <w:r>
+        <w:rPr>
+          <w:rStyle w:val="VerbatimChar"/>
+        </w:rPr>
+        <w:t xml:space="preserve">tests/tools/zprobe.js</w:t>
+      </w:r>
+      <w:r>
+        <w:t xml:space="preserve">: 0 điểm đổi lớp trên cùng), thang chữ/khoảng cách</w:t>
+      </w:r>
+      <w:r>
+        <w:t xml:space="preserve"> </w:t>
+      </w:r>
+      <w:r>
+        <w:rPr>
+          <w:rStyle w:val="VerbatimChar"/>
+        </w:rPr>
+        <w:t xml:space="preserve">--fs-*</w:t>
+      </w:r>
+      <w:r>
+        <w:t xml:space="preserve">/</w:t>
+      </w:r>
+      <w:r>
+        <w:rPr>
+          <w:rStyle w:val="VerbatimChar"/>
+        </w:rPr>
+        <w:t xml:space="preserve">--sp-*</w:t>
+      </w:r>
+      <w:r>
+        <w:t xml:space="preserve">, màn chào nằm trong tấm trượt, sửa nút dock Bản đồ không đóng khay, snackbar che nút Vị trí, camera QR chạy ngầm khi rời màn.</w:t>
+      </w:r>
+      <w:r>
+        <w:t xml:space="preserve"> </w:t>
+      </w:r>
+      <w:r>
+        <w:rPr>
+          <w:bCs/>
+          <w:b/>
+        </w:rPr>
+        <w:t xml:space="preserve">Còn lại:</w:t>
+      </w:r>
+      <w:r>
+        <w:t xml:space="preserve"> </w:t>
+      </w:r>
+      <w:r>
+        <w:rPr>
+          <w:rStyle w:val="VerbatimChar"/>
+        </w:rPr>
+        <w:t xml:space="preserve">!important</w:t>
+      </w:r>
+      <w:r>
+        <w:t xml:space="preserve"> </w:t>
+      </w:r>
+      <w:r>
+        <w:t xml:space="preserve">mới giảm 516 → 440 trong</w:t>
+      </w:r>
+      <w:r>
+        <w:t xml:space="preserve"> </w:t>
+      </w:r>
+      <w:r>
+        <w:rPr>
+          <w:rStyle w:val="VerbatimChar"/>
+        </w:rPr>
+        <w:t xml:space="preserve">&lt;style&gt;</w:t>
+      </w:r>
+      <w:r>
+        <w:t xml:space="preserve"> </w:t>
+      </w:r>
+      <w:r>
+        <w:t xml:space="preserve">(mục tiêu &lt; 50 chưa đạt): phần còn lại đều có tác dụng thật (thắng luật khác/kiểu inline do JS gắn, luật cho modal/nhãn không dựng sẵn,</w:t>
+      </w:r>
+      <w:r>
+        <w:t xml:space="preserve"> </w:t>
+      </w:r>
+      <w:r>
+        <w:t xml:space="preserve">@media</w:t>
+      </w:r>
+      <w:r>
+        <w:t xml:space="preserve"> </w:t>
+      </w:r>
+      <w:r>
+        <w:t xml:space="preserve">print) — muốn giảm tiếp phải tách luật thủ công theo từng khối. Ảnh trước–sau ở trang đề xuất https://claude.ai/artifact/5wUji3PZKePvjc3mZcQbd8.</w:t>
+      </w:r>
+    </w:p>
+    <w:p>
+      <w:pPr>
+        <w:numPr>
+          <w:ilvl w:val="0"/>
+          <w:numId w:val="1001"/>
+        </w:numPr>
+        <w:pStyle w:val="Compact"/>
+      </w:pPr>
+      <w:r>
+        <w:rPr>
+          <w:bCs/>
+          <w:b/>
+        </w:rPr>
         <w:t xml:space="preserve">drawPlot từ chối</w:t>
       </w:r>
       <w:r>
@@ -6546,6 +6868,82 @@
             </w:pPr>
             <w:r>
               <w:t xml:space="preserve">HM-08f (hướng B hoàn tất: ảnh vào wizard, dọn mã chết, màn chào)</w:t>
+            </w:r>
+          </w:p>
+        </w:tc>
+      </w:tr>
+      <w:tr>
+        <w:tc>
+          <w:tcPr/>
+          <w:p>
+            <w:pPr>
+              <w:pStyle w:val="Compact"/>
+              <w:jc w:val="left"/>
+            </w:pPr>
+            <w:r>
+              <w:t xml:space="preserve">P07</w:t>
+            </w:r>
+          </w:p>
+        </w:tc>
+        <w:tc>
+          <w:tcPr/>
+          <w:p>
+            <w:pPr>
+              <w:pStyle w:val="Compact"/>
+              <w:jc w:val="left"/>
+            </w:pPr>
+            <w:r>
+              <w:t xml:space="preserve">session_01SkwQ3cwS7GRmmnPqAbVswr</w:t>
+            </w:r>
+          </w:p>
+        </w:tc>
+        <w:tc>
+          <w:tcPr/>
+          <w:p>
+            <w:pPr>
+              <w:pStyle w:val="Compact"/>
+              <w:jc w:val="left"/>
+            </w:pPr>
+            <w:r>
+              <w:t xml:space="preserve">HM-08f (hướng B), sửa rò nút ▣, HM-46a, HM-46b, HM-46c</w:t>
+            </w:r>
+          </w:p>
+        </w:tc>
+      </w:tr>
+      <w:tr>
+        <w:tc>
+          <w:tcPr/>
+          <w:p>
+            <w:pPr>
+              <w:pStyle w:val="Compact"/>
+              <w:jc w:val="left"/>
+            </w:pPr>
+            <w:r>
+              <w:t xml:space="preserve">P08</w:t>
+            </w:r>
+          </w:p>
+        </w:tc>
+        <w:tc>
+          <w:tcPr/>
+          <w:p>
+            <w:pPr>
+              <w:pStyle w:val="Compact"/>
+              <w:jc w:val="left"/>
+            </w:pPr>
+            <w:r>
+              <w:t xml:space="preserve">session_01CbedJka1VDEMyXGXEcyohq</w:t>
+            </w:r>
+          </w:p>
+        </w:tc>
+        <w:tc>
+          <w:tcPr/>
+          <w:p>
+            <w:pPr>
+              <w:pStyle w:val="Compact"/>
+              <w:jc w:val="left"/>
+            </w:pPr>
+            <w:r>
+              <w:t xml:space="preserve">HM-46d (z-index 51→20, thang chữ/khoảng cách, !important 516→440, màn chào vào tấm trượt, ảnh trước–sau)</w:t>
             </w:r>
           </w:p>
         </w:tc>

</xml_diff>